<commit_message>
Sync team-iterated plan and email; new one-pager (PT cleanup, Leça do Balio, suggested dates)
</commit_message>
<xml_diff>
--- a/cjr-discovery/CJR_One_Pager.docx
+++ b/cjr-discovery/CJR_One_Pager.docx
@@ -6,7 +6,6 @@
       <w:tblPr>
         <w:tblW w:type="auto" w:w="0"/>
         <w:jc w:val="center"/>
-        <w:tblLayout w:type="autofit"/>
         <w:tblLook w:firstColumn="1" w:firstRow="1" w:lastColumn="0" w:lastRow="0" w:noHBand="0" w:noVBand="1" w:val="04A0"/>
         <w:tblBorders>
           <w:top w:val="none"/>
@@ -111,16 +110,13 @@
     </w:tbl>
     <w:p>
       <w:pPr>
-        <w:spacing w:before="80" w:after="280"/>
+        <w:spacing w:before="80" w:after="240"/>
         <w:pBdr>
           <w:bottom w:val="single" w:sz="18" w:space="1" w:color="00EBB6"/>
         </w:pBdr>
       </w:pPr>
     </w:p>
     <w:p>
-      <w:pPr>
-        <w:spacing w:before="200" w:after="40"/>
-      </w:pPr>
       <w:r>
         <w:rPr>
           <w:rFonts w:ascii="Calibri" w:hAnsi="Calibri"/>
@@ -132,9 +128,6 @@
       </w:r>
     </w:p>
     <w:p>
-      <w:pPr>
-        <w:spacing w:after="80"/>
-      </w:pPr>
       <w:r>
         <w:rPr>
           <w:rFonts w:ascii="Calibri" w:hAnsi="Calibri"/>
@@ -162,11 +155,17 @@
     <w:p>
       <w:r>
         <w:rPr>
-          <w:b w:val="0"/>
-          <w:i w:val="0"/>
           <w:sz w:val="19"/>
         </w:rPr>
-        <w:t>Duas semanas para compreender os processos de procurement da CJR e, em parceria, identificar por onde faz mais sentido começar, alinhar o que significa sucesso e fechar o âmbito do piloto. KPIs definidos no arranque, ligados à baseline. A implementação começa na semana seguinte.</w:t>
+        <w:t>Duas semanas de exploração e levantamento de requisitos para compreender os processos de aquisição da CJR e, em parceria, identificar por onde faz mais sentido começar a implementar agentic workflows, alinhar o que significa sucesso e fechar o âmbito do piloto. Os KPIs são definidos no arranque. A implementação começa na semana seguinte.</w:t>
+      </w:r>
+    </w:p>
+    <w:p>
+      <w:r>
+        <w:rPr>
+          <w:sz w:val="18"/>
+        </w:rPr>
+        <w:t>Equipa xgeeks nas sessões: 2 Engineering Managers, 1 Technical Product Manager, 1 Community Specialist e 1 Growth Operations Specialist.</w:t>
       </w:r>
     </w:p>
     <w:p>
@@ -181,7 +180,7 @@
           <w:color w:val="002E33"/>
           <w:sz w:val="24"/>
         </w:rPr>
-        <w:t>Estrutura das duas semanas</w:t>
+        <w:t>Estrutura das duas semanas (datas em sugestão)</w:t>
       </w:r>
     </w:p>
     <w:p>
@@ -194,15 +193,13 @@
           <w:color w:val="002E33"/>
           <w:sz w:val="19"/>
         </w:rPr>
-        <w:t xml:space="preserve">Semana 1: </w:t>
+        <w:t xml:space="preserve">Semana 1 (14 a 18 de Setembro): </w:t>
       </w:r>
       <w:r>
         <w:rPr>
-          <w:b w:val="0"/>
-          <w:i w:val="0"/>
           <w:sz w:val="19"/>
         </w:rPr>
-        <w:t>2 dias presenciais (workshops) + 3 dias de consolidação; kickoff, workshops do fluxo e definição do working model; review session no fecho.</w:t>
+        <w:t>2 dias presenciais (workshops) + 3 dias de consolidação; kickoff com os sponsors, workshops do fluxo e proposta do modelo de trabalho; sessão de revisão no fecho.</w:t>
       </w:r>
     </w:p>
     <w:p>
@@ -215,15 +212,13 @@
           <w:color w:val="002E33"/>
           <w:sz w:val="19"/>
         </w:rPr>
-        <w:t xml:space="preserve">Semana 2: </w:t>
+        <w:t xml:space="preserve">Semana 2 (21 a 25 de Setembro): </w:t>
       </w:r>
       <w:r>
         <w:rPr>
-          <w:b w:val="0"/>
-          <w:i w:val="0"/>
           <w:sz w:val="19"/>
         </w:rPr>
-        <w:t>2 dias presenciais (sessões marcadas a partir do que foi identificado na semana 1) + 3 dias de consolidação; review session e sessão final com a liderança.</w:t>
+        <w:t>2 dias presenciais (sessões marcadas a partir do que foi identificado na semana 1) + 3 dias de consolidação; sessão de revisão e sessão final com a liderança.</w:t>
       </w:r>
     </w:p>
     <w:p>
@@ -238,7 +233,7 @@
           <w:color w:val="002E33"/>
           <w:sz w:val="24"/>
         </w:rPr>
-        <w:t>Agenda dos dias presenciais · Leça da Palmeira</w:t>
+        <w:t>Sugestão de agenda dos dias presenciais · Leça do Balio · sessões de 1 a 2 horas</w:t>
       </w:r>
     </w:p>
     <w:p>
@@ -255,11 +250,9 @@
       </w:r>
       <w:r>
         <w:rPr>
-          <w:b w:val="0"/>
-          <w:i w:val="0"/>
           <w:sz w:val="19"/>
         </w:rPr>
-        <w:t>welcome; visita às instalações; sessão com stakeholders; almoço.</w:t>
+        <w:t>boas-vindas; visita às instalações; sessão com stakeholders; almoço.</w:t>
       </w:r>
     </w:p>
     <w:p>
@@ -276,8 +269,6 @@
       </w:r>
       <w:r>
         <w:rPr>
-          <w:b w:val="0"/>
-          <w:i w:val="0"/>
           <w:sz w:val="19"/>
         </w:rPr>
         <w:t>sessão de trabalho sobre o fluxo de procurement; workshop de gestão de fornecedores.</w:t>
@@ -297,8 +288,6 @@
       </w:r>
       <w:r>
         <w:rPr>
-          <w:b w:val="0"/>
-          <w:i w:val="0"/>
           <w:sz w:val="19"/>
         </w:rPr>
         <w:t>sessão com IT: sistemas, acessos, integrações e objetos SAP do fluxo.</w:t>
@@ -318,11 +307,9 @@
       </w:r>
       <w:r>
         <w:rPr>
-          <w:b w:val="0"/>
-          <w:i w:val="0"/>
           <w:sz w:val="19"/>
         </w:rPr>
-        <w:t>sessão com Comercial, Financeiro e Legal; wrap-up.</w:t>
+        <w:t>sessão com Comercial, Financeiro e Legal; fecho do dia.</w:t>
       </w:r>
     </w:p>
     <w:p>
@@ -337,7 +324,7 @@
           <w:color w:val="002E33"/>
           <w:sz w:val="24"/>
         </w:rPr>
-        <w:t>Sessões da semana 1</w:t>
+        <w:t>Sessões e trabalho da semana 1</w:t>
       </w:r>
     </w:p>
     <w:p>
@@ -346,11 +333,9 @@
       </w:pPr>
       <w:r>
         <w:rPr>
-          <w:b w:val="0"/>
-          <w:i w:val="0"/>
           <w:sz w:val="19"/>
         </w:rPr>
-        <w:t>Fluxo de procurement de ponta a ponta, tal como funciona hoje (SharePoint, consulta, mapa comparativo, SAP).</w:t>
+        <w:t>Fluxo de procurement de ponta a ponta, tal como funciona hoje: do ticket no SharePoint ao fecho com o fornecedor, passando pelo mapa comparativo e pelo SAP.</w:t>
       </w:r>
     </w:p>
     <w:p>
@@ -359,11 +344,9 @@
       </w:pPr>
       <w:r>
         <w:rPr>
-          <w:b w:val="0"/>
-          <w:i w:val="0"/>
           <w:sz w:val="19"/>
         </w:rPr>
-        <w:t>Gestão de fornecedores: pré-qualificação acima de 50.000 EUR, questionário (Forms) e circulação da informação.</w:t>
+        <w:t>Gestão de fornecedores: pré-qualificação acima de 50.000 EUR, questionário (Forms) e circulação da informação pela Qualidade, Compliance e Financeiro.</w:t>
       </w:r>
     </w:p>
     <w:p>
@@ -372,11 +355,9 @@
       </w:pPr>
       <w:r>
         <w:rPr>
-          <w:b w:val="0"/>
-          <w:i w:val="0"/>
           <w:sz w:val="19"/>
         </w:rPr>
-        <w:t>Acompanhamento de 2 a 3 tickets reais (Projeto e Armazém).</w:t>
+        <w:t>Acompanhamento de 2 a 3 tickets reais (Projeto e Armazém): volumes, intervenções manuais e onde se perde tempo.</w:t>
       </w:r>
     </w:p>
     <w:p>
@@ -385,11 +366,9 @@
       </w:pPr>
       <w:r>
         <w:rPr>
-          <w:b w:val="0"/>
-          <w:i w:val="0"/>
           <w:sz w:val="19"/>
         </w:rPr>
-        <w:t>Working model proposto, com daily com os principais stakeholders se necessário.</w:t>
+        <w:t>Proposta do modelo de trabalho, que pode incluir uma reunião diária com os principais stakeholders.</w:t>
       </w:r>
     </w:p>
     <w:p>
@@ -404,7 +383,7 @@
           <w:color w:val="002E33"/>
           <w:sz w:val="24"/>
         </w:rPr>
-        <w:t>Consolidação na semana 2</w:t>
+        <w:t>Consolidação e fecho na semana 2</w:t>
       </w:r>
     </w:p>
     <w:p>
@@ -413,11 +392,9 @@
       </w:pPr>
       <w:r>
         <w:rPr>
-          <w:b w:val="0"/>
-          <w:i w:val="0"/>
           <w:sz w:val="19"/>
         </w:rPr>
-        <w:t>Fluxo as-is documentado, com variantes, exceções e personas; baseline quantificada.</w:t>
+        <w:t>Fluxo atual documentado, com variantes, exceções e pessoas envolvidas; baseline quantificada (tempo por ticket, revisões, retrabalho).</w:t>
       </w:r>
     </w:p>
     <w:p>
@@ -426,11 +403,9 @@
       </w:pPr>
       <w:r>
         <w:rPr>
-          <w:b w:val="0"/>
-          <w:i w:val="0"/>
           <w:sz w:val="19"/>
         </w:rPr>
-        <w:t>Pain points consolidados; âmbito do piloto: o que fica humano e o que passa a ser agêntico.</w:t>
+        <w:t>Pontos de dor consolidados; âmbito do piloto: o que fica humano (validação técnica, decisão comercial) e o que passa a ser agêntico.</w:t>
       </w:r>
     </w:p>
     <w:p>
@@ -439,11 +414,9 @@
       </w:pPr>
       <w:r>
         <w:rPr>
-          <w:b w:val="0"/>
-          <w:i w:val="0"/>
           <w:sz w:val="19"/>
         </w:rPr>
-        <w:t>Milestones, plano de acessos e avaliação das competências internas para o suporte pós-entrega.</w:t>
+        <w:t>Milestones, plano de acessos e competências internas para o suporte pós-entrega.</w:t>
       </w:r>
     </w:p>
     <w:p>
@@ -467,8 +440,6 @@
       </w:pPr>
       <w:r>
         <w:rPr>
-          <w:b w:val="0"/>
-          <w:i w:val="0"/>
           <w:sz w:val="19"/>
         </w:rPr>
         <w:t>Responsável do workflow de Procurement nomeado, com ownership desde o primeiro dia.</w:t>
@@ -480,11 +451,9 @@
       </w:pPr>
       <w:r>
         <w:rPr>
-          <w:b w:val="0"/>
-          <w:i w:val="0"/>
           <w:sz w:val="19"/>
         </w:rPr>
-        <w:t>Confirmação dos intervenientes e responsáveis por sessão (a nossa lista é uma assunção a validar pela CJR).</w:t>
+        <w:t>Intervenientes e responsáveis confirmados por sessão (a nossa lista é uma assunção a validar pela CJR).</w:t>
       </w:r>
     </w:p>
     <w:p>
@@ -493,11 +462,9 @@
       </w:pPr>
       <w:r>
         <w:rPr>
-          <w:b w:val="0"/>
-          <w:i w:val="0"/>
           <w:sz w:val="19"/>
         </w:rPr>
-        <w:t>Disponibilidade das equipas (Procurement, Comercial, Financeiro, Compliance, Qualidade, IT).</w:t>
+        <w:t>Disponibilidade das equipas: Procurement, Comercial, Financeiro, Compliance, Qualidade e IT (sessões de 1 a 2 horas).</w:t>
       </w:r>
     </w:p>
     <w:p>
@@ -506,8 +473,6 @@
       </w:pPr>
       <w:r>
         <w:rPr>
-          <w:b w:val="0"/>
-          <w:i w:val="0"/>
           <w:sz w:val="19"/>
         </w:rPr>
         <w:t>Amostra de tickets recentes (Projeto e Armazém, com e sem requisição SAP).</w:t>
@@ -519,11 +484,9 @@
       </w:pPr>
       <w:r>
         <w:rPr>
-          <w:b w:val="0"/>
-          <w:i w:val="0"/>
           <w:sz w:val="19"/>
         </w:rPr>
-        <w:t>Dias presenciais confirmados em Leça da Palmeira.</w:t>
+        <w:t>Dias presenciais confirmados em Leça do Balio.</w:t>
       </w:r>
     </w:p>
     <w:p>
@@ -532,8 +495,6 @@
       </w:pPr>
       <w:r>
         <w:rPr>
-          <w:b w:val="0"/>
-          <w:i w:val="0"/>
           <w:sz w:val="19"/>
         </w:rPr>
         <w:t>Canais e ferramentas definidos; pedidos de acesso sandbox (SAP/SharePoint) submetidos durante a semana.</w:t>
@@ -551,7 +512,7 @@
           <w:color w:val="002E33"/>
           <w:sz w:val="24"/>
         </w:rPr>
-        <w:t>O que sai no fim</w:t>
+        <w:t>Resultados</w:t>
       </w:r>
     </w:p>
     <w:p>
@@ -560,11 +521,9 @@
       </w:pPr>
       <w:r>
         <w:rPr>
-          <w:b w:val="0"/>
-          <w:i w:val="0"/>
           <w:sz w:val="19"/>
         </w:rPr>
-        <w:t>Fluxo as-is documentado e validado, com baseline quantificada.</w:t>
+        <w:t>Fluxo de procurement atual documentado e validado, com variantes e principais exceções.</w:t>
       </w:r>
     </w:p>
     <w:p>
@@ -573,8 +532,17 @@
       </w:pPr>
       <w:r>
         <w:rPr>
-          <w:b w:val="0"/>
-          <w:i w:val="0"/>
+          <w:sz w:val="19"/>
+        </w:rPr>
+        <w:t>Baseline quantificada que define o sucesso do piloto; KPIs de impacto definidos no arranque.</w:t>
+      </w:r>
+    </w:p>
+    <w:p>
+      <w:pPr>
+        <w:pStyle w:val="ListBullet"/>
+      </w:pPr>
+      <w:r>
+        <w:rPr>
           <w:sz w:val="19"/>
         </w:rPr>
         <w:t>Âmbito do piloto fechado, com critérios e métricas de sucesso e milestones.</w:t>
@@ -586,11 +554,9 @@
       </w:pPr>
       <w:r>
         <w:rPr>
-          <w:b w:val="0"/>
-          <w:i w:val="0"/>
           <w:sz w:val="19"/>
         </w:rPr>
-        <w:t>Mapa de sistemas e plano de acessos, incluindo sandbox; lista de pain points.</w:t>
+        <w:t>Mapa de sistemas e plano de acessos, incluindo sandbox; lista de pontos de dor.</w:t>
       </w:r>
     </w:p>
     <w:p>
@@ -599,21 +565,6 @@
       </w:pPr>
       <w:r>
         <w:rPr>
-          <w:b w:val="0"/>
-          <w:i w:val="0"/>
-          <w:sz w:val="19"/>
-        </w:rPr>
-        <w:t>KPIs de impacto definidos no arranque, ligados à baseline.</w:t>
-      </w:r>
-    </w:p>
-    <w:p>
-      <w:pPr>
-        <w:pStyle w:val="ListBullet"/>
-      </w:pPr>
-      <w:r>
-        <w:rPr>
-          <w:b w:val="0"/>
-          <w:i w:val="0"/>
           <w:sz w:val="19"/>
         </w:rPr>
         <w:t>Plano de implementação faseado: fases, esforço e sequência.</w:t>

</xml_diff>

<commit_message>
Trocas PT aprovadas (fluxo de trabalho, sessao de arranque, ponto de partida) + responsavel do departamento, sinalizadas no plano; Resultados em tres entregaveis
</commit_message>
<xml_diff>
--- a/cjr-discovery/CJR_One_Pager.docx
+++ b/cjr-discovery/CJR_One_Pager.docx
@@ -165,7 +165,7 @@
         <w:rPr>
           <w:sz w:val="18"/>
         </w:rPr>
-        <w:t>Equipa xgeeks nas sessões: 2 Engineering Managers, 1 Technical Product Manager, 1 Community Specialist e 1 Growth Operations Specialist.</w:t>
+        <w:t>Equipa xgeeks nas sessões: 5 pessoas, cobrindo as áreas de engenharia, produto e negócio, nas posições certas para conduzir o projeto na sua fase inicial.</w:t>
       </w:r>
     </w:p>
     <w:p>
@@ -199,7 +199,7 @@
         <w:rPr>
           <w:sz w:val="19"/>
         </w:rPr>
-        <w:t>2 dias presenciais (workshops) + 3 dias de consolidação; kickoff com os sponsors, workshops do fluxo e proposta do modelo de trabalho; sessão de revisão no fecho.</w:t>
+        <w:t>2 dias presenciais (workshops) + 3 dias de consolidação; sessão de arranque com os sponsors, workshops do fluxo e proposta do modelo de trabalho; sessão de revisão no fecho.</w:t>
       </w:r>
     </w:p>
     <w:p>
@@ -218,7 +218,7 @@
         <w:rPr>
           <w:sz w:val="19"/>
         </w:rPr>
-        <w:t>2 dias presenciais (sessões marcadas a partir do que foi identificado na semana 1) + 3 dias de consolidação; sessão de revisão e sessão final com a liderança.</w:t>
+        <w:t>2 dias presenciais (entrevistas individuais e sessões marcadas a partir da semana 1) + 3 dias de consolidação; sessão de revisão e sessão final com a liderança.</w:t>
       </w:r>
     </w:p>
     <w:p>
@@ -233,7 +233,7 @@
           <w:color w:val="002E33"/>
           <w:sz w:val="24"/>
         </w:rPr>
-        <w:t>Sugestão de agenda dos dias presenciais · Leça do Balio · sessões de 1 a 2 horas</w:t>
+        <w:t>Sugestão de agenda presencial (semana 1) · Leça do Balio · sessões de 1 a 2 horas</w:t>
       </w:r>
     </w:p>
     <w:p>
@@ -346,7 +346,7 @@
         <w:rPr>
           <w:sz w:val="19"/>
         </w:rPr>
-        <w:t>Gestão de fornecedores: pré-qualificação acima de 50.000 EUR, questionário (Forms) e circulação da informação pela Qualidade, Compliance e Financeiro.</w:t>
+        <w:t>Gestão de fornecedores: pré-qualificação acima de 50.000 €, questionário (Forms) e circulação da informação pela Qualidade, Compliance e Financeiro.</w:t>
       </w:r>
     </w:p>
     <w:p>
@@ -383,7 +383,7 @@
           <w:color w:val="002E33"/>
           <w:sz w:val="24"/>
         </w:rPr>
-        <w:t>Consolidação e fecho na semana 2</w:t>
+        <w:t>Semana 2: entrevistas, consolidação e fecho</w:t>
       </w:r>
     </w:p>
     <w:p>
@@ -394,7 +394,18 @@
         <w:rPr>
           <w:sz w:val="19"/>
         </w:rPr>
-        <w:t>Fluxo atual documentado, com variantes, exceções e pessoas envolvidas; baseline quantificada (tempo por ticket, revisões, retrabalho).</w:t>
+        <w:t>Entrevistas individuais com as pessoas identificadas na semana 1: como trabalham, pontos de dor e o que melhorar no dia a dia.</w:t>
+      </w:r>
+    </w:p>
+    <w:p>
+      <w:pPr>
+        <w:pStyle w:val="ListBullet"/>
+      </w:pPr>
+      <w:r>
+        <w:rPr>
+          <w:sz w:val="19"/>
+        </w:rPr>
+        <w:t>Fluxo atual documentado, com variantes, exceções e pessoas envolvidas; ponto de partida quantificado (tempo por ticket, revisões, retrabalho).</w:t>
       </w:r>
     </w:p>
     <w:p>
@@ -442,7 +453,7 @@
         <w:rPr>
           <w:sz w:val="19"/>
         </w:rPr>
-        <w:t>Responsável do workflow de Procurement nomeado, com ownership desde o primeiro dia.</w:t>
+        <w:t>Responsável do departamento de Procurement nomeado, com ownership desde o primeiro dia.</w:t>
       </w:r>
     </w:p>
     <w:p>
@@ -497,7 +508,7 @@
         <w:rPr>
           <w:sz w:val="19"/>
         </w:rPr>
-        <w:t>Canais e ferramentas definidos; pedidos de acesso sandbox (SAP/SharePoint) submetidos durante a semana.</w:t>
+        <w:t>Pedidos de acesso aos ambientes de sandbox (SAP/SharePoint) submetidos durante a semana.</w:t>
       </w:r>
     </w:p>
     <w:p>
@@ -512,7 +523,7 @@
           <w:color w:val="002E33"/>
           <w:sz w:val="24"/>
         </w:rPr>
-        <w:t>Resultados</w:t>
+        <w:t>Resultados: três entregáveis</w:t>
       </w:r>
     </w:p>
     <w:p>
@@ -523,7 +534,7 @@
         <w:rPr>
           <w:sz w:val="19"/>
         </w:rPr>
-        <w:t>Fluxo de procurement atual documentado e validado, com variantes e principais exceções.</w:t>
+        <w:t>Documento de findings: fluxo de procurement documentado e validado de ponta a ponta, mapa de sistemas e acessos, pontos de dor priorizados e ponto de partida quantificado.</w:t>
       </w:r>
     </w:p>
     <w:p>
@@ -534,7 +545,7 @@
         <w:rPr>
           <w:sz w:val="19"/>
         </w:rPr>
-        <w:t>Baseline quantificada que define o sucesso do piloto; KPIs de impacto definidos no arranque.</w:t>
+        <w:t>Documento do piloto: âmbito fechado, plano de implementação com fases, esforço e milestones, e KPIs de impacto ligados ao ponto de partida.</w:t>
       </w:r>
     </w:p>
     <w:p>
@@ -545,29 +556,7 @@
         <w:rPr>
           <w:sz w:val="19"/>
         </w:rPr>
-        <w:t>Âmbito do piloto fechado, com critérios e métricas de sucesso e milestones.</w:t>
-      </w:r>
-    </w:p>
-    <w:p>
-      <w:pPr>
-        <w:pStyle w:val="ListBullet"/>
-      </w:pPr>
-      <w:r>
-        <w:rPr>
-          <w:sz w:val="19"/>
-        </w:rPr>
-        <w:t>Mapa de sistemas e plano de acessos, incluindo sandbox; lista de pontos de dor.</w:t>
-      </w:r>
-    </w:p>
-    <w:p>
-      <w:pPr>
-        <w:pStyle w:val="ListBullet"/>
-      </w:pPr>
-      <w:r>
-        <w:rPr>
-          <w:sz w:val="19"/>
-        </w:rPr>
-        <w:t>Plano de implementação faseado: fases, esforço e sequência.</w:t>
+        <w:t>Modelo de trabalho conjunto: responsável nomeado na CJR, canais de comunicação e documentação partilhada, plano de acessos aprovado.</w:t>
       </w:r>
     </w:p>
     <w:sectPr>

</xml_diff>